<commit_message>
Added one more reaserch question, hyphothesis, and future work and discussion sessions.
</commit_message>
<xml_diff>
--- a/Context_and_Plan.docx
+++ b/Context_and_Plan.docx
@@ -73,14 +73,19 @@
           <w:numId w:val="3"/>
         </w:numPr>
       </w:pPr>
-      <w:r>
-        <w:t xml:space="preserve">joy and </w:t>
-      </w:r>
-      <w:proofErr w:type="gramStart"/>
-      <w:r>
-        <w:t>whimsy?</w:t>
-      </w:r>
-      <w:proofErr w:type="gramEnd"/>
+      <w:commentRangeStart w:id="0"/>
+      <w:r>
+        <w:t>joy and whimsy?</w:t>
+      </w:r>
+      <w:commentRangeEnd w:id="0"/>
+      <w:r>
+        <w:rPr>
+          <w:rStyle w:val="CommentReference"/>
+          <w:sz w:val="24"/>
+          <w:szCs w:val="24"/>
+        </w:rPr>
+        <w:commentReference w:id="0"/>
+      </w:r>
     </w:p>
     <w:p>
       <w:pPr>
@@ -150,6 +155,18 @@
     </w:p>
     <w:p>
       <w:pPr>
+        <w:pStyle w:val="ListParagraph"/>
+        <w:numPr>
+          <w:ilvl w:val="0"/>
+          <w:numId w:val="5"/>
+        </w:numPr>
+      </w:pPr>
+      <w:r>
+        <w:t>Does haptic feedback make the ball position control easier for users?</w:t>
+      </w:r>
+    </w:p>
+    <w:p>
+      <w:pPr>
         <w:rPr>
           <w:b/>
           <w:bCs/>
@@ -172,15 +189,7 @@
         </w:numPr>
       </w:pPr>
       <w:r>
-        <w:t xml:space="preserve">Haptic feedback improves the radius accuracy of </w:t>
-      </w:r>
-      <w:proofErr w:type="gramStart"/>
-      <w:r>
-        <w:t>snow-ball</w:t>
-      </w:r>
-      <w:proofErr w:type="gramEnd"/>
-      <w:r>
-        <w:t xml:space="preserve"> making</w:t>
+        <w:t>Haptic feedback improves the radius accuracy of snow-ball making</w:t>
       </w:r>
     </w:p>
     <w:p>
@@ -192,21 +201,7 @@
         </w:numPr>
       </w:pPr>
       <w:r>
-        <w:t xml:space="preserve">Haptic feedback improves the radius </w:t>
-      </w:r>
-      <w:r>
-        <w:t>precision</w:t>
-      </w:r>
-      <w:r>
-        <w:t xml:space="preserve"> of </w:t>
-      </w:r>
-      <w:proofErr w:type="gramStart"/>
-      <w:r>
-        <w:t>snow-ball</w:t>
-      </w:r>
-      <w:proofErr w:type="gramEnd"/>
-      <w:r>
-        <w:t xml:space="preserve"> making </w:t>
+        <w:t xml:space="preserve">Haptic feedback improves the radius precision of snow-ball making </w:t>
       </w:r>
     </w:p>
     <w:p>
@@ -218,23 +213,19 @@
         </w:numPr>
       </w:pPr>
       <w:r>
-        <w:t xml:space="preserve">Haptic feedback does not lead to significantly higher performance when combined with visual </w:t>
-      </w:r>
-      <w:proofErr w:type="gramStart"/>
-      <w:r>
-        <w:t>feedback</w:t>
-      </w:r>
-      <w:proofErr w:type="gramEnd"/>
-      <w:r>
-        <w:t xml:space="preserve"> </w:t>
-      </w:r>
-      <w:proofErr w:type="gramStart"/>
-      <w:r>
-        <w:t>but</w:t>
-      </w:r>
-      <w:proofErr w:type="gramEnd"/>
-      <w:r>
-        <w:t xml:space="preserve"> does when visual feedback is taken away (?) </w:t>
+        <w:t xml:space="preserve">Haptic feedback does not lead to significantly higher performance when combined with visual feedback but does when visual feedback is taken away (?) </w:t>
+      </w:r>
+    </w:p>
+    <w:p>
+      <w:pPr>
+        <w:pStyle w:val="ListParagraph"/>
+        <w:numPr>
+          <w:ilvl w:val="0"/>
+          <w:numId w:val="3"/>
+        </w:numPr>
+      </w:pPr>
+      <w:r>
+        <w:t xml:space="preserve">Haptic feedback makes it easier for users to control the ball position. </w:t>
       </w:r>
     </w:p>
     <w:p>
@@ -382,10 +373,7 @@
         <w:sym w:font="Wingdings" w:char="F0E0"/>
       </w:r>
       <w:r>
-        <w:t xml:space="preserve"> RQ</w:t>
-      </w:r>
-      <w:r>
-        <w:t>3</w:t>
+        <w:t xml:space="preserve"> RQ3</w:t>
       </w:r>
     </w:p>
     <w:p>
@@ -466,10 +454,7 @@
         <w:sym w:font="Wingdings" w:char="F0E0"/>
       </w:r>
       <w:r>
-        <w:t xml:space="preserve"> RQ</w:t>
-      </w:r>
-      <w:r>
-        <w:t>3</w:t>
+        <w:t xml:space="preserve"> RQ3</w:t>
       </w:r>
     </w:p>
     <w:p>
@@ -481,6 +466,7 @@
         </w:numPr>
       </w:pPr>
       <w:r>
+        <w:lastRenderedPageBreak/>
         <w:t>size variance between the balls</w:t>
       </w:r>
       <w:r>
@@ -511,10 +497,67 @@
         <w:sym w:font="Wingdings" w:char="F0E0"/>
       </w:r>
       <w:r>
-        <w:t xml:space="preserve"> RQ</w:t>
-      </w:r>
-      <w:r>
-        <w:t>3</w:t>
+        <w:t xml:space="preserve"> RQ3</w:t>
+      </w:r>
+    </w:p>
+    <w:p>
+      <w:pPr>
+        <w:pStyle w:val="ListParagraph"/>
+        <w:numPr>
+          <w:ilvl w:val="0"/>
+          <w:numId w:val="3"/>
+        </w:numPr>
+      </w:pPr>
+      <w:r>
+        <w:t xml:space="preserve">Task 3: Navigating between trees in the environment. </w:t>
+      </w:r>
+    </w:p>
+    <w:p>
+      <w:pPr>
+        <w:pStyle w:val="ListParagraph"/>
+        <w:numPr>
+          <w:ilvl w:val="1"/>
+          <w:numId w:val="3"/>
+        </w:numPr>
+      </w:pPr>
+      <w:r>
+        <w:t>Testing conditions:</w:t>
+      </w:r>
+    </w:p>
+    <w:p>
+      <w:pPr>
+        <w:pStyle w:val="ListParagraph"/>
+        <w:numPr>
+          <w:ilvl w:val="2"/>
+          <w:numId w:val="3"/>
+        </w:numPr>
+      </w:pPr>
+      <w:r>
+        <w:t>With only visual feedback / with visual and haptic feedback</w:t>
+      </w:r>
+    </w:p>
+    <w:p>
+      <w:pPr>
+        <w:pStyle w:val="ListParagraph"/>
+        <w:numPr>
+          <w:ilvl w:val="1"/>
+          <w:numId w:val="3"/>
+        </w:numPr>
+      </w:pPr>
+      <w:r>
+        <w:t>Evaluation Metrics:</w:t>
+      </w:r>
+    </w:p>
+    <w:p>
+      <w:pPr>
+        <w:pStyle w:val="ListParagraph"/>
+        <w:numPr>
+          <w:ilvl w:val="2"/>
+          <w:numId w:val="3"/>
+        </w:numPr>
+      </w:pPr>
+      <w:r>
+        <w:t>Number of trees hit per trial.</w:t>
       </w:r>
     </w:p>
     <w:p>
@@ -529,7 +572,6 @@
           <w:b/>
           <w:bCs/>
         </w:rPr>
-        <w:lastRenderedPageBreak/>
         <w:t>Visualizations for conclusions</w:t>
       </w:r>
     </w:p>
@@ -579,6 +621,100 @@
       </w:pPr>
       <w:r>
         <w:t>User Experience Evaluation</w:t>
+      </w:r>
+    </w:p>
+    <w:p>
+      <w:pPr>
+        <w:rPr>
+          <w:b/>
+          <w:bCs/>
+        </w:rPr>
+      </w:pPr>
+      <w:r>
+        <w:rPr>
+          <w:b/>
+          <w:bCs/>
+        </w:rPr>
+        <w:t>Discussion:</w:t>
+      </w:r>
+    </w:p>
+    <w:p>
+      <w:pPr>
+        <w:pStyle w:val="ListParagraph"/>
+        <w:numPr>
+          <w:ilvl w:val="0"/>
+          <w:numId w:val="3"/>
+        </w:numPr>
+        <w:rPr>
+          <w:b/>
+          <w:bCs/>
+        </w:rPr>
+      </w:pPr>
+      <w:r>
+        <w:t>how do different force field profiles influence perception.</w:t>
+      </w:r>
+    </w:p>
+    <w:p>
+      <w:pPr>
+        <w:pStyle w:val="ListParagraph"/>
+        <w:numPr>
+          <w:ilvl w:val="0"/>
+          <w:numId w:val="3"/>
+        </w:numPr>
+        <w:rPr>
+          <w:b/>
+          <w:bCs/>
+        </w:rPr>
+      </w:pPr>
+      <w:r>
+        <w:t>???</w:t>
+      </w:r>
+    </w:p>
+    <w:p>
+      <w:pPr>
+        <w:rPr>
+          <w:b/>
+          <w:bCs/>
+        </w:rPr>
+      </w:pPr>
+      <w:r>
+        <w:rPr>
+          <w:b/>
+          <w:bCs/>
+        </w:rPr>
+        <w:t>Future work:</w:t>
+      </w:r>
+    </w:p>
+    <w:p>
+      <w:pPr>
+        <w:pStyle w:val="ListParagraph"/>
+        <w:numPr>
+          <w:ilvl w:val="0"/>
+          <w:numId w:val="3"/>
+        </w:numPr>
+        <w:rPr>
+          <w:b/>
+          <w:bCs/>
+        </w:rPr>
+      </w:pPr>
+      <w:r>
+        <w:t xml:space="preserve">Introduce imperfections to the ball. </w:t>
+      </w:r>
+    </w:p>
+    <w:p>
+      <w:pPr>
+        <w:pStyle w:val="ListParagraph"/>
+        <w:numPr>
+          <w:ilvl w:val="0"/>
+          <w:numId w:val="3"/>
+        </w:numPr>
+        <w:rPr>
+          <w:b/>
+          <w:bCs/>
+        </w:rPr>
+      </w:pPr>
+      <w:r>
+        <w:t>???</w:t>
       </w:r>
     </w:p>
     <w:sectPr>
@@ -589,6 +725,48 @@
     </w:sectPr>
   </w:body>
 </w:document>
+</file>
+
+<file path=word/comments.xml><?xml version="1.0" encoding="utf-8"?>
+<w:comments xmlns:wpc="http://schemas.microsoft.com/office/word/2010/wordprocessingCanvas" xmlns:cx="http://schemas.microsoft.com/office/drawing/2014/chartex" xmlns:cx1="http://schemas.microsoft.com/office/drawing/2015/9/8/chartex" xmlns:cx2="http://schemas.microsoft.com/office/drawing/2015/10/21/chartex" xmlns:cx3="http://schemas.microsoft.com/office/drawing/2016/5/9/chartex" xmlns:cx4="http://schemas.microsoft.com/office/drawing/2016/5/10/chartex" xmlns:cx5="http://schemas.microsoft.com/office/drawing/2016/5/11/chartex" xmlns:cx6="http://schemas.microsoft.com/office/drawing/2016/5/12/chartex" xmlns:cx7="http://schemas.microsoft.com/office/drawing/2016/5/13/chartex" xmlns:cx8="http://schemas.microsoft.com/office/drawing/2016/5/14/chartex" xmlns:mc="http://schemas.openxmlformats.org/markup-compatibility/2006" xmlns:aink="http://schemas.microsoft.com/office/drawing/2016/ink" xmlns:am3d="http://schemas.microsoft.com/office/drawing/2017/model3d" xmlns:o="urn:schemas-microsoft-com:office:office" xmlns:oel="http://schemas.microsoft.com/office/2019/extlst" xmlns:r="http://schemas.openxmlformats.org/officeDocument/2006/relationships" xmlns:m="http://schemas.openxmlformats.org/officeDocument/2006/math" xmlns:v="urn:schemas-microsoft-com:vml" xmlns:wp14="http://schemas.microsoft.com/office/word/2010/wordprocessingDrawing" xmlns:wp="http://schemas.openxmlformats.org/drawingml/2006/wordprocessingDrawing" xmlns:w10="urn:schemas-microsoft-com:office:word" xmlns:w="http://schemas.openxmlformats.org/wordprocessingml/2006/main" xmlns:w14="http://schemas.microsoft.com/office/word/2010/wordml" xmlns:w15="http://schemas.microsoft.com/office/word/2012/wordml" xmlns:w16cex="http://schemas.microsoft.com/office/word/2018/wordml/cex" xmlns:w16cid="http://schemas.microsoft.com/office/word/2016/wordml/cid" xmlns:w16="http://schemas.microsoft.com/office/word/2018/wordml" xmlns:w16du="http://schemas.microsoft.com/office/word/2023/wordml/word16du" xmlns:w16sdtdh="http://schemas.microsoft.com/office/word/2020/wordml/sdtdatahash" xmlns:w16sdtfl="http://schemas.microsoft.com/office/word/2024/wordml/sdtformatlock" xmlns:w16se="http://schemas.microsoft.com/office/word/2015/wordml/symex" xmlns:wpg="http://schemas.microsoft.com/office/word/2010/wordprocessingGroup" xmlns:wpi="http://schemas.microsoft.com/office/word/2010/wordprocessingInk" xmlns:wne="http://schemas.microsoft.com/office/word/2006/wordml" xmlns:wps="http://schemas.microsoft.com/office/word/2010/wordprocessingShape" mc:Ignorable="w14 w15 w16se w16cid w16 w16cex w16sdtdh w16sdtfl w16du wp14">
+  <w:comment w:id="0" w:author="Marcel Aleksander Mińkowski" w:date="2026-03-21T19:26:00Z" w:initials="MM">
+    <w:p>
+      <w:pPr>
+        <w:pStyle w:val="CommentText"/>
+      </w:pPr>
+      <w:r>
+        <w:rPr>
+          <w:rStyle w:val="CommentReference"/>
+        </w:rPr>
+        <w:annotationRef/>
+      </w:r>
+      <w:r>
+        <w:rPr>
+          <w:lang w:val="pl-PL"/>
+        </w:rPr>
+        <w:t>Entertainment, rehabilitation?</w:t>
+      </w:r>
+    </w:p>
+  </w:comment>
+</w:comments>
+</file>
+
+<file path=word/commentsExtended.xml><?xml version="1.0" encoding="utf-8"?>
+<w15:commentsEx xmlns:wpc="http://schemas.microsoft.com/office/word/2010/wordprocessingCanvas" xmlns:cx="http://schemas.microsoft.com/office/drawing/2014/chartex" xmlns:cx1="http://schemas.microsoft.com/office/drawing/2015/9/8/chartex" xmlns:cx2="http://schemas.microsoft.com/office/drawing/2015/10/21/chartex" xmlns:cx3="http://schemas.microsoft.com/office/drawing/2016/5/9/chartex" xmlns:cx4="http://schemas.microsoft.com/office/drawing/2016/5/10/chartex" xmlns:cx5="http://schemas.microsoft.com/office/drawing/2016/5/11/chartex" xmlns:cx6="http://schemas.microsoft.com/office/drawing/2016/5/12/chartex" xmlns:cx7="http://schemas.microsoft.com/office/drawing/2016/5/13/chartex" xmlns:cx8="http://schemas.microsoft.com/office/drawing/2016/5/14/chartex" xmlns:mc="http://schemas.openxmlformats.org/markup-compatibility/2006" xmlns:aink="http://schemas.microsoft.com/office/drawing/2016/ink" xmlns:am3d="http://schemas.microsoft.com/office/drawing/2017/model3d" xmlns:o="urn:schemas-microsoft-com:office:office" xmlns:oel="http://schemas.microsoft.com/office/2019/extlst" xmlns:r="http://schemas.openxmlformats.org/officeDocument/2006/relationships" xmlns:m="http://schemas.openxmlformats.org/officeDocument/2006/math" xmlns:v="urn:schemas-microsoft-com:vml" xmlns:wp14="http://schemas.microsoft.com/office/word/2010/wordprocessingDrawing" xmlns:wp="http://schemas.openxmlformats.org/drawingml/2006/wordprocessingDrawing" xmlns:w10="urn:schemas-microsoft-com:office:word" xmlns:w="http://schemas.openxmlformats.org/wordprocessingml/2006/main" xmlns:w14="http://schemas.microsoft.com/office/word/2010/wordml" xmlns:w15="http://schemas.microsoft.com/office/word/2012/wordml" xmlns:w16cex="http://schemas.microsoft.com/office/word/2018/wordml/cex" xmlns:w16cid="http://schemas.microsoft.com/office/word/2016/wordml/cid" xmlns:w16="http://schemas.microsoft.com/office/word/2018/wordml" xmlns:w16du="http://schemas.microsoft.com/office/word/2023/wordml/word16du" xmlns:w16sdtdh="http://schemas.microsoft.com/office/word/2020/wordml/sdtdatahash" xmlns:w16sdtfl="http://schemas.microsoft.com/office/word/2024/wordml/sdtformatlock" xmlns:w16se="http://schemas.microsoft.com/office/word/2015/wordml/symex" xmlns:wpg="http://schemas.microsoft.com/office/word/2010/wordprocessingGroup" xmlns:wpi="http://schemas.microsoft.com/office/word/2010/wordprocessingInk" xmlns:wne="http://schemas.microsoft.com/office/word/2006/wordml" xmlns:wps="http://schemas.microsoft.com/office/word/2010/wordprocessingShape" mc:Ignorable="w14 w15 w16se w16cid w16 w16cex w16sdtdh w16sdtfl w16du wp14">
+  <w15:commentEx w15:paraId="7348A17A" w15:done="0"/>
+</w15:commentsEx>
+</file>
+
+<file path=word/commentsExtensible.xml><?xml version="1.0" encoding="utf-8"?>
+<w16cex:commentsExtensible xmlns:wpc="http://schemas.microsoft.com/office/word/2010/wordprocessingCanvas" xmlns:cx="http://schemas.microsoft.com/office/drawing/2014/chartex" xmlns:cx1="http://schemas.microsoft.com/office/drawing/2015/9/8/chartex" xmlns:cx2="http://schemas.microsoft.com/office/drawing/2015/10/21/chartex" xmlns:cx3="http://schemas.microsoft.com/office/drawing/2016/5/9/chartex" xmlns:cx4="http://schemas.microsoft.com/office/drawing/2016/5/10/chartex" xmlns:cx5="http://schemas.microsoft.com/office/drawing/2016/5/11/chartex" xmlns:cx6="http://schemas.microsoft.com/office/drawing/2016/5/12/chartex" xmlns:cx7="http://schemas.microsoft.com/office/drawing/2016/5/13/chartex" xmlns:cx8="http://schemas.microsoft.com/office/drawing/2016/5/14/chartex" xmlns:cr="http://schemas.microsoft.com/office/comments/2020/reactions" xmlns:mc="http://schemas.openxmlformats.org/markup-compatibility/2006" xmlns:aink="http://schemas.microsoft.com/office/drawing/2016/ink" xmlns:am3d="http://schemas.microsoft.com/office/drawing/2017/model3d" xmlns:o="urn:schemas-microsoft-com:office:office" xmlns:oel="http://schemas.microsoft.com/office/2019/extlst" xmlns:r="http://schemas.openxmlformats.org/officeDocument/2006/relationships" xmlns:m="http://schemas.openxmlformats.org/officeDocument/2006/math" xmlns:v="urn:schemas-microsoft-com:vml" xmlns:wp14="http://schemas.microsoft.com/office/word/2010/wordprocessingDrawing" xmlns:wp="http://schemas.openxmlformats.org/drawingml/2006/wordprocessingDrawing" xmlns:w10="urn:schemas-microsoft-com:office:word" xmlns:w="http://schemas.openxmlformats.org/wordprocessingml/2006/main" xmlns:w14="http://schemas.microsoft.com/office/word/2010/wordml" xmlns:w15="http://schemas.microsoft.com/office/word/2012/wordml" xmlns:w16cex="http://schemas.microsoft.com/office/word/2018/wordml/cex" xmlns:w16cid="http://schemas.microsoft.com/office/word/2016/wordml/cid" xmlns:w16="http://schemas.microsoft.com/office/word/2018/wordml" xmlns:w16du="http://schemas.microsoft.com/office/word/2023/wordml/word16du" xmlns:w16sdtdh="http://schemas.microsoft.com/office/word/2020/wordml/sdtdatahash" xmlns:w16sdtfl="http://schemas.microsoft.com/office/word/2024/wordml/sdtformatlock" xmlns:w16se="http://schemas.microsoft.com/office/word/2015/wordml/symex" xmlns:wpg="http://schemas.microsoft.com/office/word/2010/wordprocessingGroup" xmlns:wpi="http://schemas.microsoft.com/office/word/2010/wordprocessingInk" xmlns:wne="http://schemas.microsoft.com/office/word/2006/wordml" xmlns:wps="http://schemas.microsoft.com/office/word/2010/wordprocessingShape" mc:Ignorable="w14 w15 w16se w16cid w16 w16cex w16sdtdh w16sdtfl cr w16du wp14">
+  <w16cex:commentExtensible w16cex:durableId="31690A83" w16cex:dateUtc="2026-03-21T18:26:00Z"/>
+</w16cex:commentsExtensible>
+</file>
+
+<file path=word/commentsIds.xml><?xml version="1.0" encoding="utf-8"?>
+<w16cid:commentsIds xmlns:wpc="http://schemas.microsoft.com/office/word/2010/wordprocessingCanvas" xmlns:cx="http://schemas.microsoft.com/office/drawing/2014/chartex" xmlns:cx1="http://schemas.microsoft.com/office/drawing/2015/9/8/chartex" xmlns:cx2="http://schemas.microsoft.com/office/drawing/2015/10/21/chartex" xmlns:cx3="http://schemas.microsoft.com/office/drawing/2016/5/9/chartex" xmlns:cx4="http://schemas.microsoft.com/office/drawing/2016/5/10/chartex" xmlns:cx5="http://schemas.microsoft.com/office/drawing/2016/5/11/chartex" xmlns:cx6="http://schemas.microsoft.com/office/drawing/2016/5/12/chartex" xmlns:cx7="http://schemas.microsoft.com/office/drawing/2016/5/13/chartex" xmlns:cx8="http://schemas.microsoft.com/office/drawing/2016/5/14/chartex" xmlns:mc="http://schemas.openxmlformats.org/markup-compatibility/2006" xmlns:aink="http://schemas.microsoft.com/office/drawing/2016/ink" xmlns:am3d="http://schemas.microsoft.com/office/drawing/2017/model3d" xmlns:o="urn:schemas-microsoft-com:office:office" xmlns:oel="http://schemas.microsoft.com/office/2019/extlst" xmlns:r="http://schemas.openxmlformats.org/officeDocument/2006/relationships" xmlns:m="http://schemas.openxmlformats.org/officeDocument/2006/math" xmlns:v="urn:schemas-microsoft-com:vml" xmlns:wp14="http://schemas.microsoft.com/office/word/2010/wordprocessingDrawing" xmlns:wp="http://schemas.openxmlformats.org/drawingml/2006/wordprocessingDrawing" xmlns:w10="urn:schemas-microsoft-com:office:word" xmlns:w="http://schemas.openxmlformats.org/wordprocessingml/2006/main" xmlns:w14="http://schemas.microsoft.com/office/word/2010/wordml" xmlns:w15="http://schemas.microsoft.com/office/word/2012/wordml" xmlns:w16cex="http://schemas.microsoft.com/office/word/2018/wordml/cex" xmlns:w16cid="http://schemas.microsoft.com/office/word/2016/wordml/cid" xmlns:w16="http://schemas.microsoft.com/office/word/2018/wordml" xmlns:w16du="http://schemas.microsoft.com/office/word/2023/wordml/word16du" xmlns:w16sdtdh="http://schemas.microsoft.com/office/word/2020/wordml/sdtdatahash" xmlns:w16sdtfl="http://schemas.microsoft.com/office/word/2024/wordml/sdtformatlock" xmlns:w16se="http://schemas.microsoft.com/office/word/2015/wordml/symex" xmlns:wpg="http://schemas.microsoft.com/office/word/2010/wordprocessingGroup" xmlns:wpi="http://schemas.microsoft.com/office/word/2010/wordprocessingInk" xmlns:wne="http://schemas.microsoft.com/office/word/2006/wordml" xmlns:wps="http://schemas.microsoft.com/office/word/2010/wordprocessingShape" mc:Ignorable="w14 w15 w16se w16cid w16 w16cex w16sdtdh w16sdtfl w16du wp14">
+  <w16cid:commentId w16cid:paraId="7348A17A" w16cid:durableId="31690A83"/>
+</w16cid:commentsIds>
 </file>
 
 <file path=word/numbering.xml><?xml version="1.0" encoding="utf-8"?>
@@ -1170,6 +1348,14 @@
     <w:abstractNumId w:val="3"/>
   </w:num>
 </w:numbering>
+</file>
+
+<file path=word/people.xml><?xml version="1.0" encoding="utf-8"?>
+<w15:people xmlns:wpc="http://schemas.microsoft.com/office/word/2010/wordprocessingCanvas" xmlns:cx="http://schemas.microsoft.com/office/drawing/2014/chartex" xmlns:cx1="http://schemas.microsoft.com/office/drawing/2015/9/8/chartex" xmlns:cx2="http://schemas.microsoft.com/office/drawing/2015/10/21/chartex" xmlns:cx3="http://schemas.microsoft.com/office/drawing/2016/5/9/chartex" xmlns:cx4="http://schemas.microsoft.com/office/drawing/2016/5/10/chartex" xmlns:cx5="http://schemas.microsoft.com/office/drawing/2016/5/11/chartex" xmlns:cx6="http://schemas.microsoft.com/office/drawing/2016/5/12/chartex" xmlns:cx7="http://schemas.microsoft.com/office/drawing/2016/5/13/chartex" xmlns:cx8="http://schemas.microsoft.com/office/drawing/2016/5/14/chartex" xmlns:mc="http://schemas.openxmlformats.org/markup-compatibility/2006" xmlns:aink="http://schemas.microsoft.com/office/drawing/2016/ink" xmlns:am3d="http://schemas.microsoft.com/office/drawing/2017/model3d" xmlns:o="urn:schemas-microsoft-com:office:office" xmlns:oel="http://schemas.microsoft.com/office/2019/extlst" xmlns:r="http://schemas.openxmlformats.org/officeDocument/2006/relationships" xmlns:m="http://schemas.openxmlformats.org/officeDocument/2006/math" xmlns:v="urn:schemas-microsoft-com:vml" xmlns:wp14="http://schemas.microsoft.com/office/word/2010/wordprocessingDrawing" xmlns:wp="http://schemas.openxmlformats.org/drawingml/2006/wordprocessingDrawing" xmlns:w10="urn:schemas-microsoft-com:office:word" xmlns:w="http://schemas.openxmlformats.org/wordprocessingml/2006/main" xmlns:w14="http://schemas.microsoft.com/office/word/2010/wordml" xmlns:w15="http://schemas.microsoft.com/office/word/2012/wordml" xmlns:w16cex="http://schemas.microsoft.com/office/word/2018/wordml/cex" xmlns:w16cid="http://schemas.microsoft.com/office/word/2016/wordml/cid" xmlns:w16="http://schemas.microsoft.com/office/word/2018/wordml" xmlns:w16du="http://schemas.microsoft.com/office/word/2023/wordml/word16du" xmlns:w16sdtdh="http://schemas.microsoft.com/office/word/2020/wordml/sdtdatahash" xmlns:w16sdtfl="http://schemas.microsoft.com/office/word/2024/wordml/sdtformatlock" xmlns:w16se="http://schemas.microsoft.com/office/word/2015/wordml/symex" xmlns:wpg="http://schemas.microsoft.com/office/word/2010/wordprocessingGroup" xmlns:wpi="http://schemas.microsoft.com/office/word/2010/wordprocessingInk" xmlns:wne="http://schemas.microsoft.com/office/word/2006/wordml" xmlns:wps="http://schemas.microsoft.com/office/word/2010/wordprocessingShape" mc:Ignorable="w14 w15 w16se w16cid w16 w16cex w16sdtdh w16sdtfl w16du wp14">
+  <w15:person w15:author="Marcel Aleksander Mińkowski">
+    <w15:presenceInfo w15:providerId="AD" w15:userId="S::maminkowski@tudelft.nl::75836fd2-efce-4164-bb85-0262070a8870"/>
+  </w15:person>
+</w15:people>
 </file>
 
 <file path=word/styles.xml><?xml version="1.0" encoding="utf-8"?>
@@ -2089,6 +2275,72 @@
       <w:spacing w:val="5"/>
     </w:rPr>
   </w:style>
+  <w:style w:type="character" w:styleId="CommentReference">
+    <w:name w:val="annotation reference"/>
+    <w:basedOn w:val="DefaultParagraphFont"/>
+    <w:uiPriority w:val="99"/>
+    <w:semiHidden/>
+    <w:unhideWhenUsed/>
+    <w:rsid w:val="00850E70"/>
+    <w:rPr>
+      <w:sz w:val="16"/>
+      <w:szCs w:val="16"/>
+    </w:rPr>
+  </w:style>
+  <w:style w:type="paragraph" w:styleId="CommentText">
+    <w:name w:val="annotation text"/>
+    <w:basedOn w:val="Normal"/>
+    <w:link w:val="CommentTextChar"/>
+    <w:uiPriority w:val="99"/>
+    <w:unhideWhenUsed/>
+    <w:rsid w:val="00850E70"/>
+    <w:pPr>
+      <w:spacing w:line="240" w:lineRule="auto"/>
+    </w:pPr>
+    <w:rPr>
+      <w:sz w:val="20"/>
+      <w:szCs w:val="20"/>
+    </w:rPr>
+  </w:style>
+  <w:style w:type="character" w:customStyle="1" w:styleId="CommentTextChar">
+    <w:name w:val="Comment Text Char"/>
+    <w:basedOn w:val="DefaultParagraphFont"/>
+    <w:link w:val="CommentText"/>
+    <w:uiPriority w:val="99"/>
+    <w:rsid w:val="00850E70"/>
+    <w:rPr>
+      <w:sz w:val="20"/>
+      <w:szCs w:val="20"/>
+    </w:rPr>
+  </w:style>
+  <w:style w:type="paragraph" w:styleId="CommentSubject">
+    <w:name w:val="annotation subject"/>
+    <w:basedOn w:val="CommentText"/>
+    <w:next w:val="CommentText"/>
+    <w:link w:val="CommentSubjectChar"/>
+    <w:uiPriority w:val="99"/>
+    <w:semiHidden/>
+    <w:unhideWhenUsed/>
+    <w:rsid w:val="00850E70"/>
+    <w:rPr>
+      <w:b/>
+      <w:bCs/>
+    </w:rPr>
+  </w:style>
+  <w:style w:type="character" w:customStyle="1" w:styleId="CommentSubjectChar">
+    <w:name w:val="Comment Subject Char"/>
+    <w:basedOn w:val="CommentTextChar"/>
+    <w:link w:val="CommentSubject"/>
+    <w:uiPriority w:val="99"/>
+    <w:semiHidden/>
+    <w:rsid w:val="00850E70"/>
+    <w:rPr>
+      <w:b/>
+      <w:bCs/>
+      <w:sz w:val="20"/>
+      <w:szCs w:val="20"/>
+    </w:rPr>
+  </w:style>
 </w:styles>
 </file>
 

</xml_diff>